<commit_message>
AthDGC site update 2026-06-19 23:09 --- clean Quarto render, real Zenodo DOI 10.5281/zenodo.20439182, samples-only public release
</commit_message>
<xml_diff>
--- a/data_paper.docx
+++ b/data_paper.docx
@@ -12,10 +12,16 @@
     </w:p>
     <w:p>
       <w:pPr>
-        <w:pStyle w:val="Subtitle"/>
-      </w:pPr>
-      <w:r>
-        <w:t xml:space="preserve">GlossaContactLab Working Papers, NKUA digital edition</w:t>
+        <w:pStyle w:val="Author"/>
+      </w:pPr>
+      <w:r>
+        <w:t xml:space="preserve">Nikolaos Lavidas</w:t>
+      </w:r>
+      <w:r>
+        <w:rPr>
+          <w:vertAlign w:val="superscript"/>
+        </w:rPr>
+        <w:t xml:space="preserve">1</w:t>
       </w:r>
     </w:p>
     <w:p>
@@ -23,7 +29,13 @@
         <w:pStyle w:val="Author"/>
       </w:pPr>
       <w:r>
-        <w:t xml:space="preserve">Nikolaos Lavidas</w:t>
+        <w:t xml:space="preserve">Kiki Nikiforidou</w:t>
+      </w:r>
+      <w:r>
+        <w:rPr>
+          <w:vertAlign w:val="superscript"/>
+        </w:rPr>
+        <w:t xml:space="preserve">1</w:t>
       </w:r>
     </w:p>
     <w:p>
@@ -31,7 +43,13 @@
         <w:pStyle w:val="Author"/>
       </w:pPr>
       <w:r>
-        <w:t xml:space="preserve">Kiki Nikiforidou</w:t>
+        <w:t xml:space="preserve">Dag Haug</w:t>
+      </w:r>
+      <w:r>
+        <w:rPr>
+          <w:vertAlign w:val="superscript"/>
+        </w:rPr>
+        <w:t xml:space="preserve">2</w:t>
       </w:r>
     </w:p>
     <w:p>
@@ -39,7 +57,13 @@
         <w:pStyle w:val="Author"/>
       </w:pPr>
       <w:r>
-        <w:t xml:space="preserve">Dag Haug</w:t>
+        <w:t xml:space="preserve">Leonid Kulikov</w:t>
+      </w:r>
+      <w:r>
+        <w:rPr>
+          <w:vertAlign w:val="superscript"/>
+        </w:rPr>
+        <w:t xml:space="preserve">3</w:t>
       </w:r>
     </w:p>
     <w:p>
@@ -47,7 +71,13 @@
         <w:pStyle w:val="Author"/>
       </w:pPr>
       <w:r>
-        <w:t xml:space="preserve">Leonid Kulikov</w:t>
+        <w:t xml:space="preserve">Vassiliki Geka</w:t>
+      </w:r>
+      <w:r>
+        <w:rPr>
+          <w:vertAlign w:val="superscript"/>
+        </w:rPr>
+        <w:t xml:space="preserve">1</w:t>
       </w:r>
     </w:p>
     <w:p>
@@ -55,7 +85,13 @@
         <w:pStyle w:val="Author"/>
       </w:pPr>
       <w:r>
-        <w:t xml:space="preserve">Vassiliki Geka</w:t>
+        <w:t xml:space="preserve">Vassileios Symeonidis</w:t>
+      </w:r>
+      <w:r>
+        <w:rPr>
+          <w:vertAlign w:val="superscript"/>
+        </w:rPr>
+        <w:t xml:space="preserve">1</w:t>
       </w:r>
     </w:p>
     <w:p>
@@ -63,7 +99,13 @@
         <w:pStyle w:val="Author"/>
       </w:pPr>
       <w:r>
-        <w:t xml:space="preserve">Vassileios Symeonidis</w:t>
+        <w:t xml:space="preserve">Theodoros Michalareas</w:t>
+      </w:r>
+      <w:r>
+        <w:rPr>
+          <w:vertAlign w:val="superscript"/>
+        </w:rPr>
+        <w:t xml:space="preserve">1</w:t>
       </w:r>
     </w:p>
     <w:p>
@@ -71,7 +113,13 @@
         <w:pStyle w:val="Author"/>
       </w:pPr>
       <w:r>
-        <w:t xml:space="preserve">Theodoros Michalareas</w:t>
+        <w:t xml:space="preserve">Sofia Chionidi</w:t>
+      </w:r>
+      <w:r>
+        <w:rPr>
+          <w:vertAlign w:val="superscript"/>
+        </w:rPr>
+        <w:t xml:space="preserve">1</w:t>
       </w:r>
     </w:p>
     <w:p>
@@ -79,7 +127,13 @@
         <w:pStyle w:val="Author"/>
       </w:pPr>
       <w:r>
-        <w:t xml:space="preserve">Sofia Chionidi</w:t>
+        <w:t xml:space="preserve">Anastasia Tsiropina</w:t>
+      </w:r>
+      <w:r>
+        <w:rPr>
+          <w:vertAlign w:val="superscript"/>
+        </w:rPr>
+        <w:t xml:space="preserve">1</w:t>
       </w:r>
     </w:p>
     <w:p>
@@ -87,7 +141,13 @@
         <w:pStyle w:val="Author"/>
       </w:pPr>
       <w:r>
-        <w:t xml:space="preserve">Anastasia Tsiropina</w:t>
+        <w:t xml:space="preserve">Eleni Plakoutsi</w:t>
+      </w:r>
+      <w:r>
+        <w:rPr>
+          <w:vertAlign w:val="superscript"/>
+        </w:rPr>
+        <w:t xml:space="preserve">1</w:t>
       </w:r>
     </w:p>
     <w:p>
@@ -95,37 +155,35 @@
         <w:pStyle w:val="Author"/>
       </w:pPr>
       <w:r>
-        <w:t xml:space="preserve">Eleni Plakoutsi</w:t>
+        <w:t xml:space="preserve">Evangelos Argyropoulos</w:t>
+      </w:r>
+      <w:r>
+        <w:rPr>
+          <w:vertAlign w:val="superscript"/>
+        </w:rPr>
+        <w:t xml:space="preserve">1</w:t>
       </w:r>
     </w:p>
     <w:p>
       <w:pPr>
-        <w:pStyle w:val="Author"/>
-      </w:pPr>
-      <w:r>
-        <w:t xml:space="preserve">Evangelos Argyropoulos</w:t>
+        <w:pStyle w:val="AbstractTitle"/>
+      </w:pPr>
+      <w:r>
+        <w:t xml:space="preserve">Abstract</w:t>
       </w:r>
     </w:p>
     <w:p>
       <w:pPr>
-        <w:pStyle w:val="AbstractTitle"/>
-      </w:pPr>
-      <w:r>
-        <w:t xml:space="preserve">Abstract</w:t>
-      </w:r>
-    </w:p>
-    <w:p>
-      <w:pPr>
         <w:pStyle w:val="Abstract"/>
       </w:pPr>
       <w:r>
-        <w:t xml:space="preserve">AthDGC (“Athens-PROIEL”) is an open, end-to-end workflow and dataset. It is,</w:t>
+        <w:t xml:space="preserve">AthDGC (“Athens-PROIEL”) is an open, end-to-end workflow and dataset. It provides</w:t>
       </w:r>
       <w:r>
         <w:t xml:space="preserve"> </w:t>
       </w:r>
       <w:r>
-        <w:t xml:space="preserve">to the best of our knowledge, the first openly licensed dependency-parsed</w:t>
+        <w:t xml:space="preserve">an openly licensed dependency-parsed</w:t>
       </w:r>
       <w:r>
         <w:t xml:space="preserve"> </w:t>
@@ -245,7 +303,7 @@
           <w:b/>
           <w:bCs/>
         </w:rPr>
-        <w:t xml:space="preserve">For all parts of this platform (site, tools, corpus, slides, launch report) please cite:</w:t>
+        <w:t xml:space="preserve">Please cite as:</w:t>
       </w:r>
     </w:p>
     <w:p>
@@ -263,25 +321,27 @@
           <w:i/>
           <w:iCs/>
         </w:rPr>
-        <w:t xml:space="preserve">AthDGC: Athens Digital Glossa Chronos</w:t>
+        <w:t xml:space="preserve">AthDGC: An Open Diachronic Greek Treebank with Indo-European Parallels</w:t>
+      </w:r>
+      <w:r>
+        <w:t xml:space="preserve">. National and Kapodistrian University of Athens, Athens Digital Glossa Chronos Research Network. Zenodo.</w:t>
       </w:r>
       <w:r>
         <w:t xml:space="preserve"> </w:t>
       </w:r>
-      <w:r>
-        <w:t xml:space="preserve">(A platform of computational tools and a diachronic Greek treebank, with Indo-European parallels). National and Kapodistrian University of Athens, Athens Digital Glossa Chronos Research Network. Zenodo (an open research-data repository hosted at CERN that mints permanent DOIs).</w:t>
-      </w:r>
-      <w:r>
-        <w:t xml:space="preserve"> </w:t>
-      </w:r>
-      <w:r>
-        <w:rPr>
-          <w:rStyle w:val="VerbatimChar"/>
-        </w:rPr>
-        <w:t xml:space="preserve">https://doi.org/10.5281/zenodo.20439182</w:t>
+      <w:hyperlink r:id="rId9">
+        <w:r>
+          <w:rPr>
+            <w:rStyle w:val="Hyperlink"/>
+          </w:rPr>
+          <w:t xml:space="preserve">https://doi.org/10.5281/zenodo.20439182</w:t>
+        </w:r>
+      </w:hyperlink>
+      <w:r>
+        <w:t xml:space="preserve">.</w:t>
       </w:r>
     </w:p>
-    <w:bookmarkStart w:id="12" w:name="overview"/>
+    <w:bookmarkStart w:id="15" w:name="overview"/>
     <w:p>
       <w:pPr>
         <w:pStyle w:val="Heading2"/>
@@ -290,7 +350,7 @@
         <w:t xml:space="preserve">1. Overview</w:t>
       </w:r>
     </w:p>
-    <w:bookmarkStart w:id="9" w:name="context-and-motivation"/>
+    <w:bookmarkStart w:id="10" w:name="context-and-motivation"/>
     <w:p>
       <w:pPr>
         <w:pStyle w:val="Heading3"/>
@@ -331,8 +391,8 @@
         <w:t xml:space="preserve">The project’s specific scholarly focus is retranslation: the same canonical text is re-rendered into Greek across periods (Homeric, Koine, Byzantine, Modern) and into sister languages (Latin, Gothic, Old Church Slavonic, Classical Armenian) across the Indo-European family. The platform records these re-renderings as a retelling and retranslation chain (see §3.3 below), a machine-queryable structure in which the same passage is annotated for syntax, argument structure, and morphology at every node of the chain, so that the diachronic researcher can ask, with a single query, which structural patterns persist from Homer to the Kakridis-Kazantzakis prose Iliad of 1955, and which collapse under the Byzantine epitome of Tzetzes.</w:t>
       </w:r>
     </w:p>
-    <w:bookmarkEnd w:id="9"/>
-    <w:bookmarkStart w:id="10" w:name="repository-location"/>
+    <w:bookmarkEnd w:id="10"/>
+    <w:bookmarkStart w:id="11" w:name="repository-location"/>
     <w:p>
       <w:pPr>
         <w:pStyle w:val="Heading3"/>
@@ -349,14 +409,14 @@
         <w:t xml:space="preserve">The public showcase of the platform is hosted at https://athdgc.github.io, and the v0.4.0 source-code snapshot is permanently deposited on Zenodo (an open-access research-data repository operated by CERN, which mints persistent DOIs for each deposit) under concept DOI 10.5281/zenodo.20439182. A concept DOI (a Digital Object Identifier that always resolves to the latest version of a deposited record) is the citation handle that does not change as the project versions advance; per-version DOIs are minted automatically on each release. The source repository AthDGC/Diachronic-Linguistics-Platform on GitHub remains private during the v0.5 audit pass, and becomes public at the v0.5 release, when the consolidated tools/ directory and the verified annotated partitions are in place.</w:t>
       </w:r>
     </w:p>
-    <w:bookmarkEnd w:id="10"/>
-    <w:bookmarkStart w:id="11" w:name="institutional-context"/>
+    <w:bookmarkEnd w:id="11"/>
+    <w:bookmarkStart w:id="12" w:name="project-resources-live"/>
     <w:p>
       <w:pPr>
         <w:pStyle w:val="Heading3"/>
       </w:pPr>
       <w:r>
-        <w:t xml:space="preserve">1.3 Institutional context</w:t>
+        <w:t xml:space="preserve">1.3 Project resources (live)</w:t>
       </w:r>
     </w:p>
     <w:p>
@@ -364,43 +424,23 @@
         <w:pStyle w:val="FirstParagraph"/>
       </w:pPr>
       <w:r>
-        <w:t xml:space="preserve">AthDGC is developed at the National and Kapodistrian University of Athens (NKUA), Division of Language-Linguistics, Department of English Language and Literature, School of Philosophy, under the direction of Prof. Nikolaos Lavidas. Compute is supplied by GRNET ARIS, the Greek national high-performance computing cluster (a shared cluster of fast machines operated by the Greek Research and Technology Network for academic computational workloads), under allocation pa260305.</w:t>
-      </w:r>
-    </w:p>
-    <w:bookmarkEnd w:id="11"/>
-    <w:bookmarkEnd w:id="12"/>
-    <w:bookmarkStart w:id="19" w:name="method"/>
-    <w:p>
-      <w:pPr>
-        <w:pStyle w:val="Heading2"/>
-      </w:pPr>
-      <w:r>
-        <w:t xml:space="preserve">2. Method</w:t>
+        <w:t xml:space="preserve">Beyond the public showcase site at https://athdgc.github.io, the project maintains three working resources that track the day-by-day state of the corpus and the manual annotation pass.</w:t>
       </w:r>
     </w:p>
     <w:p>
       <w:pPr>
-        <w:pStyle w:val="FirstParagraph"/>
-      </w:pPr>
-      <w:r>
-        <w:t xml:space="preserve">The AthDGC workflow runs in six stages: discovery, filtering, conversion, annotation, argument-structure capture, and cross-lingual alignment. We describe each stage in turn and illustrate it with a worked example carried through the opening line of the Iliad, μῆνιν ἄειδε θεὰ Πηληϊάδεω Ἀχιλῆος (“Wrath sing, goddess, of Peleiades Achilles”), so that the reader can follow the same sentence from raw input to a fully annotated and cross-aligned record.</w:t>
-      </w:r>
-    </w:p>
-    <w:bookmarkStart w:id="13" w:name="discovery"/>
-    <w:p>
-      <w:pPr>
-        <w:pStyle w:val="Heading3"/>
-      </w:pPr>
-      <w:r>
-        <w:t xml:space="preserve">2.1 Discovery</w:t>
+        <w:pStyle w:val="BodyText"/>
+      </w:pPr>
+      <w:r>
+        <w:t xml:space="preserve">The first is the AthDGC corpus repository, a closed-access GitHub repository at https://github.com/AthDGC/athdgc-corpus that is the canonical Git-managed working location of the AthDGC corpus across the eight Greek diachronic periods and the four Indo-European parallels (with Sanskrit, Old English, Avestan, Old Persian, and Ukrainian queued at v0.7). Access is restricted to the eleven-member team during the v0.4 to v0.5 audit pass; the public release of the annotated partitions follows at v0.5 as a separate Zenodo dataset record under CC-BY-4.0.</w:t>
       </w:r>
     </w:p>
     <w:p>
       <w:pPr>
-        <w:pStyle w:val="FirstParagraph"/>
-      </w:pPr>
-      <w:r>
-        <w:t xml:space="preserve">Source material reaches AthDGC through three complementary channels, of which the first runs daily and the other two are continuous on a slower cadence.</w:t>
+        <w:pStyle w:val="BodyText"/>
+      </w:pPr>
+      <w:r>
+        <w:t xml:space="preserve">The second is the per-language unique-identifier and metadata register, an Excel-format Google Sheet at https://docs.google.com/spreadsheets/d/1MiXcxAedaHgdnj62q-zTQsS3Q4iGTyQU/edit?gid=997932237 with one sheet per language (grc for Greek, lat for Latin, got for Gothic, chu for Old Church Slavonic, xcl for Classical Armenian, plus the queued IE witnesses). For each sentence in the corpus the register holds the unique identifier, the period assignment, the source archive, the edition, the licence, and the ingestion timestamp; this register is the bridge between the file-level partitions in the corpus repository and the per-sentence annotations in the PROIEL XML 2.0 layer.</w:t>
       </w:r>
     </w:p>
     <w:p>
@@ -408,23 +448,59 @@
         <w:pStyle w:val="BodyText"/>
       </w:pPr>
       <w:r>
-        <w:t xml:space="preserve">The first channel is the daily online-archive harvest. Each day, the discovery stage probes online open-access repositories for new or updated Greek and parallel-language source material. The repositories currently probed include archive.org, the Perseus Digital Library (the standard online archive of classical-Greek and Latin texts maintained by Tufts University), the Open Greek and Latin First Thousand Years of Greek collection at Leipzig, Wikisource Greek (el.wikisource.org), the Diorisis Corpus (the lemmatised classical-Greek corpus by Vatri and McGillivray), and OpenGreekAndLatin / PerseusDL on GitHub. For the parallel languages, the discovery stage probes the Wulfila Project at the University of Antwerp (Gothic), TITUS at the University of Frankfurt (Old Church Slavonic and Classical Armenian), GRETIL at Goettingen (Sanskrit), TEAMS at the Robbins Library (Old English), and the National Library of Ukraine facsimile collection.</w:t>
+        <w:t xml:space="preserve">The third is the live PROIEL annotation interface at https://dialing.enl.uoa.gr/proiel/, hosted at the National and Kapodistrian University of Athens (Division of Language-Linguistics, Department of English Language and Literature, School of Philosophy). This is the PROIEL XML 2.0 annotation web platform on which the AthDGC team performs and reviews the manual layer of PROIEL annotations on top of the Stanford Stanza pre-annotation pass, and on which the showcase samples published at https://athdgc.github.io are queried.</w:t>
+      </w:r>
+    </w:p>
+    <w:bookmarkEnd w:id="12"/>
+    <w:bookmarkStart w:id="13" w:name="institutional-context"/>
+    <w:p>
+      <w:pPr>
+        <w:pStyle w:val="Heading3"/>
+      </w:pPr>
+      <w:r>
+        <w:t xml:space="preserve">1.4 Institutional context</w:t>
       </w:r>
     </w:p>
     <w:p>
       <w:pPr>
-        <w:pStyle w:val="BodyText"/>
-      </w:pPr>
-      <w:r>
-        <w:t xml:space="preserve">The second channel is in-house digitisation, namely the OCR (Optical Character Recognition, the conversion of scanned page images into machine-readable text) of out-of-copyright printed editions held by NKUA and partner institutions. This channel covers pre-1928 Teubner editions, the Patrologia Graeca volumes not yet available in clean text form, scanned Early Modern Greek printed books from the Anemi collection at the University of Crete, and equivalent printed material from collaborating Departments of Classical Studies in the CIVIS Alliance and at other Greek universities. Manuscript facsimiles supplied by project partners enter through the same channel and are flagged in the corpus metadata with the supplying institution and the corresponding editorial provenance.</w:t>
+        <w:pStyle w:val="FirstParagraph"/>
+      </w:pPr>
+      <w:r>
+        <w:t xml:space="preserve">AthDGC is developed at the National and Kapodistrian University of Athens (NKUA), Division of Language-Linguistics, Department of English Language and Literature, School of Philosophy, under the direction of Prof. Nikolaos Lavidas. Compute is supplied by GRNET ARIS, the Greek national high-performance computing cluster (a shared cluster of fast machines operated by the Greek Research and Technology Network for academic computational workloads), under allocation pa260305.</w:t>
+      </w:r>
+    </w:p>
+    <w:bookmarkEnd w:id="13"/>
+    <w:bookmarkStart w:id="14" w:name="Xb9ebaa1b36320a00ddcf1cca137d7258b17edff"/>
+    <w:p>
+      <w:pPr>
+        <w:pStyle w:val="Heading3"/>
+      </w:pPr>
+      <w:r>
+        <w:t xml:space="preserve">1.5 Origin of the diachronic-Greek PROIEL line, Thessaloniki and Oslo, 2012</w:t>
       </w:r>
     </w:p>
     <w:p>
       <w:pPr>
-        <w:pStyle w:val="BodyText"/>
-      </w:pPr>
-      <w:r>
-        <w:t xml:space="preserve">The third channel is community contribution, namely the submission of prepared text or annotation by external researchers and by KEDIVIM continuing-education-course participants (see §5). Such contributions are versioned in the public GitHub repository as pull requests, pass the same PROIEL XML 2.0 schema validator and house-style check that govern internal contributions (see §3.4), and on acceptance receive co-authorship acknowledgement on the next release notes.</w:t>
+        <w:pStyle w:val="FirstParagraph"/>
+      </w:pPr>
+      <w:r>
+        <w:t xml:space="preserve">The diachronic-Greek PROIEL line that AthDGC continues began in 2012 as a Thessaloniki and Oslo collaboration between Prof. Dag Trygve Truslew Haug (University of Oslo, PROIEL Project Director) and Nikolaos Lavidas, then at the University of Thessaloniki. The first joint anchor text was George Sphrantzes,</w:t>
+      </w:r>
+      <w:r>
+        <w:t xml:space="preserve"> </w:t>
+      </w:r>
+      <w:r>
+        <w:rPr>
+          <w:i/>
+          <w:iCs/>
+        </w:rPr>
+        <w:t xml:space="preserve">Chronicon Sive Minus</w:t>
+      </w:r>
+      <w:r>
+        <w:t xml:space="preserve"> </w:t>
+      </w:r>
+      <w:r>
+        <w:t xml:space="preserve">(Chronicles, post-1453, ed. Grecu 1966), the principal historiographic account of the Fall of Constantinople and the only post-Koine, Late-Byzantine Greek text in the original PROIEL release series. The annotated edition was published in PROIEL Release 20180408 under CC-BY-NC-SA 4.0, with principal investigators Dag Trygve Truslew Haug and Nikolaos Lavidas, and funding from the University of Oslo and the University of Thessaloniki. The annotation and review team comprised Þorsteinn Vilhjálmsson, Anastasia Michali, Maria Geramani, Evgenia Klidona, Athina Papadopoulou, and Dag Haug. The release is available at the PROIEL Treebank GitHub repository at https://github.com/proiel/proiel-treebank and is browsable sentence by sentence at https://syntacticus.org under source identifier proiel:20180408:chron (for example, https://syntacticus.org/sentence/proiel:20180408:chron:89063). The Oslo side of the collaboration is housed in the Foni research group in linguistics (Forskergruppe i lingvistikk) at the Department of Philosophy, Classics, History of Art and Ideas, University of Oslo.</w:t>
       </w:r>
     </w:p>
     <w:p>
@@ -432,17 +508,18 @@
         <w:pStyle w:val="BodyText"/>
       </w:pPr>
       <w:r>
-        <w:t xml:space="preserve">For the Iliad worked example, the discovery stage retrieves the Homeric text from the Perseus Digital Library through its CTS URN (Canonical Text Services Uniform Resource Name, a standard identifier scheme used by classical-text repositories for referring to a specific edition of a specific work), urn:cts:greekLit:tlg0012.tlg001, together with the Kakridis-Kazantzakis 1955 prose translation, mirrored on Wikisource, and the Tzetzes Byzantine epitome from Bibliotheca Augustana.</w:t>
+        <w:t xml:space="preserve">The Sphrantzes Chronicle is therefore the historical hinge between the original PROIEL programme and AthDGC. PROIEL covered Greek up to the Koine of the New Testament, with Sphrantzes as the lone post-Koine, Late-Byzantine extension. AthDGC takes that extension as a starting point and carries it through the entire Greek diachronic span (Archaic, Classical, Koine, Late Antique, Byzantine, Late Byzantine, Early Modern, Modern), under the same PROIEL XML 2.0 schema and the same relation inventory. The 2012 Thessaloniki and Oslo collaboration thus continues today, with the same PROIEL Project Director (Prof. Dag T. T. Haug, Oslo) and the same Greek PI (Prof. Nikolaos Lavidas), now at the National and Kapodistrian University of Athens, funded by HFRI Project No. 20577 and the Greece 2.0 National Recovery and Resilience Plan, and supported by GRNET ARIS allocation pa260305.</w:t>
       </w:r>
     </w:p>
-    <w:bookmarkEnd w:id="13"/>
-    <w:bookmarkStart w:id="14" w:name="filtering"/>
+    <w:bookmarkEnd w:id="14"/>
+    <w:bookmarkEnd w:id="15"/>
+    <w:bookmarkStart w:id="22" w:name="method"/>
     <w:p>
       <w:pPr>
-        <w:pStyle w:val="Heading3"/>
-      </w:pPr>
-      <w:r>
-        <w:t xml:space="preserve">2.2 Filtering</w:t>
+        <w:pStyle w:val="Heading2"/>
+      </w:pPr>
+      <w:r>
+        <w:t xml:space="preserve">2. Method</w:t>
       </w:r>
     </w:p>
     <w:p>
@@ -450,17 +527,16 @@
         <w:pStyle w:val="FirstParagraph"/>
       </w:pPr>
       <w:r>
-        <w:t xml:space="preserve">Candidate texts are filtered by Greek-script ratio (at least 75% of alphabetic characters in the Greek Unicode blocks U+0370-U+03FF and U+1F00-U+1FFF), by a Path-B line filter (an in-house regular-expression filter that removes bilingual editorial apparatus such as Latin headers, page-number lines, and critical-edition footnote markers from the textual stream), and by content-hash deduplication (an SHA-256 hash of the normalised text is checked against a registry of previously ingested files, so that identical files discovered at multiple mirrors are ingested only once). A candidate that fails any of the three filters is rejected at this stage and logged for review; the v0.5 release notes will report per-archive rejection statistics.</w:t>
+        <w:t xml:space="preserve">The AthDGC workflow runs in six stages: discovery, filtering, conversion, annotation, argument-structure capture, and cross-lingual alignment. We describe each stage in turn and illustrate it with a worked example carried through the opening line of the Iliad, μῆνιν ἄειδε θεὰ Πηληϊάδεω Ἀχιλῆος (“Wrath sing, goddess, of Peleiades Achilles”), so that the reader can follow the same sentence from raw input to a fully annotated and cross-aligned record.</w:t>
       </w:r>
     </w:p>
-    <w:bookmarkEnd w:id="14"/>
-    <w:bookmarkStart w:id="15" w:name="conversion"/>
+    <w:bookmarkStart w:id="16" w:name="discovery"/>
     <w:p>
       <w:pPr>
         <w:pStyle w:val="Heading3"/>
       </w:pPr>
       <w:r>
-        <w:t xml:space="preserve">2.3 Conversion</w:t>
+        <w:t xml:space="preserve">2.1 Discovery</w:t>
       </w:r>
     </w:p>
     <w:p>
@@ -468,62 +544,49 @@
         <w:pStyle w:val="FirstParagraph"/>
       </w:pPr>
       <w:r>
-        <w:t xml:space="preserve">Surviving text is converted into the PROIEL XML 2.0 schema with sentence-level structure. The PROIEL XML 2.0 schema is XML (a plain-text format that stores structured information in tagged elements) with each sentence wrapped in a</w:t>
-      </w:r>
-      <w:r>
-        <w:t xml:space="preserve"> </w:t>
-      </w:r>
-      <w:r>
-        <w:t xml:space="preserve"> </w:t>
-      </w:r>
-      <w:r>
-        <w:t xml:space="preserve">element, each token wrapped in a</w:t>
-      </w:r>
-      <w:r>
-        <w:t xml:space="preserve"> </w:t>
-      </w:r>
-      <w:r>
-        <w:t xml:space="preserve"> </w:t>
-      </w:r>
-      <w:r>
-        <w:t xml:space="preserve">element, and every token carrying attributes for its form, lemma, part-of-speech tag (pos), ten-character morphological tag (morphology), syntactic head identifier (head-id), and dependency relation to that head (relation). For the worked example, the conversion stage produces a</w:t>
-      </w:r>
-      <w:r>
-        <w:t xml:space="preserve"> </w:t>
-      </w:r>
-      <w:r>
-        <w:t xml:space="preserve"> </w:t>
-      </w:r>
-      <w:r>
-        <w:t xml:space="preserve">containing five tokens for μῆνιν ἄειδε θεὰ Πηληϊάδεω Ἀχιλῆος and writes the initial sentence header together with the empty token-attribute scaffolding that the next stage fills in.</w:t>
-      </w:r>
-    </w:p>
-    <w:bookmarkEnd w:id="15"/>
-    <w:bookmarkStart w:id="16" w:name="annotation"/>
-    <w:p>
-      <w:pPr>
-        <w:pStyle w:val="Heading3"/>
-      </w:pPr>
-      <w:r>
-        <w:t xml:space="preserve">2.4 Annotation</w:t>
+        <w:t xml:space="preserve">Source material reaches AthDGC through three complementary channels, of which the first runs daily and the other two are continuous on a slower cadence.</w:t>
       </w:r>
     </w:p>
     <w:p>
       <w:pPr>
-        <w:pStyle w:val="FirstParagraph"/>
-      </w:pPr>
-      <w:r>
-        <w:t xml:space="preserve">Annotation is performed sentence by sentence with the Stanford Stanza processor (Qi et al. 2020, 101–8). Stanza (Stanford’s open-source Python toolkit for automatic linguistic annotation, which performs tokenisation, lemmatisation, part-of-speech tagging, morphological analysis, and dependency parsing in a single workflow) provides PROIEL-trained models for several of the older Indo-European languages: grc_proiel for Koine Greek, la_proiel for Latin, cu_proiel for Old Church Slavonic, and got_proiel for Gothic. Classical Armenian is annotated through a PROIEL-style workflow currently under development; ingestion of the v0.4 Armenian sample is complete, and the full v0.5 annotation will use a fine-tuned Stanza model (a fine-tuned model is one that has been further trained on a smaller, target-specific dataset on top of its general-purpose training, so that it adapts to the particular text type in question) trained on TITUS Armenian material. The Stanza output for each sentence is then normalised to the PROIEL XML 2.0 schema; AthDGC publishes PROIEL XML 2.0 only, with no CoNLL-U (the line-by-line tab-separated format used by the Universal Dependencies project, with one token per line and one column per annotation attribute) or other format offered, since the analytical workflow downstream of the corpus (argument-structure extraction, alignment graph, classifier features) depends on the PROIEL relation inventory. For the worked example, Stanza assigns μῆνιν the lemma μῆνις, part-of-speech Nb, morphology Nb-s—fa- (a noun, singular, feminine, accusative), head identifier 2, and relation obj (direct object). The verb ἄειδε receives lemma ἀείδω, part-of-speech V-, morphology V-spia— (verb, second person singular, present, imperative, active), head identifier 0 (sentence root), and relation pred (predicate).</w:t>
+        <w:pStyle w:val="BodyText"/>
+      </w:pPr>
+      <w:r>
+        <w:t xml:space="preserve">The first channel is the daily online-archive harvest. Each day, the discovery stage probes online open-access repositories for new or updated Greek and parallel-language source material. The repositories currently probed include archive.org, the Perseus Digital Library (the standard online archive of classical-Greek and Latin texts maintained by Tufts University), the Open Greek and Latin First Thousand Years of Greek collection at Leipzig, Wikisource Greek (el.wikisource.org), the Diorisis Corpus (the lemmatised classical-Greek corpus by Vatri and McGillivray), and OpenGreekAndLatin / PerseusDL on GitHub. For the parallel languages, the discovery stage probes the Wulfila Project at the University of Antwerp (Gothic), TITUS at the University of Frankfurt (Old Church Slavonic and Classical Armenian), GRETIL at Goettingen (Sanskrit), TEAMS at the Robbins Library (Old English), and the National Library of Ukraine facsimile collection.</w:t>
+      </w:r>
+    </w:p>
+    <w:p>
+      <w:pPr>
+        <w:pStyle w:val="BodyText"/>
+      </w:pPr>
+      <w:r>
+        <w:t xml:space="preserve">The second channel is in-house digitisation, namely the OCR (Optical Character Recognition, the conversion of scanned page images into machine-readable text) of out-of-copyright printed editions held by NKUA and partner institutions. This channel covers pre-1928 Teubner editions, the Patrologia Graeca volumes not yet available in clean text form, scanned Early Modern Greek printed books from the Anemi collection at the University of Crete, and equivalent printed material from collaborating Departments of Classical Studies in the CIVIS Alliance and at other Greek universities. Manuscript facsimiles supplied by project partners enter through the same channel and are flagged in the corpus metadata with the supplying institution and the corresponding editorial provenance.</w:t>
+      </w:r>
+    </w:p>
+    <w:p>
+      <w:pPr>
+        <w:pStyle w:val="BodyText"/>
+      </w:pPr>
+      <w:r>
+        <w:t xml:space="preserve">The third channel is community contribution, namely the submission of prepared text or annotation by external researchers and by KEDIVIM continuing-education-course participants (see §5). Such contributions are versioned in the public GitHub repository as pull requests, pass the same PROIEL XML 2.0 schema validator and house-style check that govern internal contributions (see §3.4), and on acceptance receive co-authorship acknowledgement on the next release notes.</w:t>
+      </w:r>
+    </w:p>
+    <w:p>
+      <w:pPr>
+        <w:pStyle w:val="BodyText"/>
+      </w:pPr>
+      <w:r>
+        <w:t xml:space="preserve">For the Iliad worked example, the discovery stage retrieves the Homeric text from the Perseus Digital Library through its CTS URN (Canonical Text Services Uniform Resource Name, a standard identifier scheme used by classical-text repositories for referring to a specific edition of a specific work), urn:cts:greekLit:tlg0012.tlg001, together with the Kakridis-Kazantzakis 1955 prose translation, mirrored on Wikisource, and the Tzetzes Byzantine epitome from Bibliotheca Augustana.</w:t>
       </w:r>
     </w:p>
     <w:bookmarkEnd w:id="16"/>
-    <w:bookmarkStart w:id="17" w:name="argument-structure-capture"/>
+    <w:bookmarkStart w:id="17" w:name="filtering"/>
     <w:p>
       <w:pPr>
         <w:pStyle w:val="Heading3"/>
       </w:pPr>
       <w:r>
-        <w:t xml:space="preserve">2.5 Argument-structure capture</w:t>
+        <w:t xml:space="preserve">2.2 Filtering</w:t>
       </w:r>
     </w:p>
     <w:p>
@@ -531,17 +594,17 @@
         <w:pStyle w:val="FirstParagraph"/>
       </w:pPr>
       <w:r>
-        <w:t xml:space="preserve">Beyond standard dependency annotation, AthDGC extracts an explicit argument-structure frame for every verb token, using the PROIEL relation inventory strictly. The argument-structure frame records, for one verb, the syntactic and semantic role of each of its arguments: the subject (sub, including the raised patterns xobj for raising objects and nonsub for non-subject controllers), the direct object (obj), the indirect and oblique arguments (iobj for indirect object, obl for oblique), the vocative addressee (voc), the voice (active, middle, or passive), and the aspect (perfective or imperfective). For the worked example, the verb ἄειδε receives the frame [sub:imp.2sg, obj:μῆνιν(acc.sg.f), voc:θεὰ(voc.sg.f), voice:active, aspect:imperfective]. This frame is the unit on which downstream queries operate: a diachronic researcher can ask, for instance, across the Iliad reception, does the verb of singing retain its direct-object case-marking through the Byzantine epitome and the Modern Greek prose translation, or does it switch to a prepositional phrase? and receive an answer that does not require manual re-reading of the texts.</w:t>
+        <w:t xml:space="preserve">Candidate texts are filtered by Greek-script ratio (at least 75% of alphabetic characters in the Greek Unicode blocks U+0370-U+03FF and U+1F00-U+1FFF), by a Path-B line filter (an in-house regular-expression filter that removes bilingual editorial apparatus such as Latin headers, page-number lines, and critical-edition footnote markers from the textual stream), and by content-hash deduplication (an SHA-256 hash of the normalised text is checked against a registry of previously ingested files, so that identical files discovered at multiple mirrors are ingested only once). A candidate that fails any of the three filters is rejected at this stage and logged for review; the v0.5 release notes will report per-archive rejection statistics.</w:t>
       </w:r>
     </w:p>
     <w:bookmarkEnd w:id="17"/>
-    <w:bookmarkStart w:id="18" w:name="cross-lingual-alignment"/>
+    <w:bookmarkStart w:id="18" w:name="conversion"/>
     <w:p>
       <w:pPr>
         <w:pStyle w:val="Heading3"/>
       </w:pPr>
       <w:r>
-        <w:t xml:space="preserve">2.6 Cross-lingual alignment</w:t>
+        <w:t xml:space="preserve">2.3 Conversion</w:t>
       </w:r>
     </w:p>
     <w:p>
@@ -549,33 +612,114 @@
         <w:pStyle w:val="FirstParagraph"/>
       </w:pPr>
       <w:r>
-        <w:t xml:space="preserve">Sentence-level alignment uses LaBSE embeddings (Feng et al. 2022, 878–91). LaBSE (Language-Agnostic BERT Sentence Embedding, a multilingual sentence-embedding model that maps sentences from over 100 languages into a single 1,500-dimensional vector space, so that translation pairs land close to each other regardless of the source language) provides the similarity score used to match a Greek New Testament verse to its Latin Vulgate, Gothic Wulfila, Old Church Slavonic Marianus, or Classical Armenian counterpart. Word-level alignment uses multilingual-BERT attention through the AwesomeAlign procedure</w:t>
+        <w:t xml:space="preserve">Surviving text is converted into the PROIEL XML 2.0 schema with sentence-level structure. The PROIEL XML 2.0 schema is XML (a plain-text format that stores structured information in tagged elements) with each sentence wrapped in a</w:t>
       </w:r>
       <w:r>
         <w:t xml:space="preserve"> </w:t>
       </w:r>
       <w:r>
-        <w:t xml:space="preserve">(Dou and Neubig 2021, 2112–28)</w:t>
-      </w:r>
-      <w:r>
-        <w:t xml:space="preserve">. Multilingual BERT (Google’s neural language model pre-trained on text from 104 languages) emits cross-attention weights between the tokens of the source and target sentences; AwesomeAlign converts these weights into a discrete word-alignment matrix through a fine-tuning step on parallel corpora. Phonetic cognate scoring, finally, uses ASJP sound-class encoding (the Automated Similarity Judgment Program sound-class system, which reduces every phonetic segment to one of 41 equivalence classes that ignore fine phonetic detail) and LingPy edit distance</w:t>
-      </w:r>
-      <w:r>
         <w:t xml:space="preserve"> </w:t>
       </w:r>
       <w:r>
-        <w:t xml:space="preserve">(List 2014, 1–228)</w:t>
+        <w:t xml:space="preserve">element, each token wrapped in a</w:t>
       </w:r>
       <w:r>
         <w:t xml:space="preserve"> </w:t>
       </w:r>
       <w:r>
-        <w:t xml:space="preserve">for detection of cognate pairs across the Indo-European witnesses.</w:t>
+        <w:t xml:space="preserve"> </w:t>
+      </w:r>
+      <w:r>
+        <w:t xml:space="preserve">element, and every token carrying attributes for its form, lemma, part-of-speech tag (pos), ten-character morphological tag (morphology), syntactic head identifier (head-id), and dependency relation to that head (relation). For the worked example, the conversion stage produces a</w:t>
+      </w:r>
+      <w:r>
+        <w:t xml:space="preserve"> </w:t>
+      </w:r>
+      <w:r>
+        <w:t xml:space="preserve"> </w:t>
+      </w:r>
+      <w:r>
+        <w:t xml:space="preserve">containing five tokens for μῆνιν ἄειδε θεὰ Πηληϊάδεω Ἀχιλῆος and writes the initial sentence header together with the empty token-attribute scaffolding that the next stage fills in.</w:t>
       </w:r>
     </w:p>
     <w:bookmarkEnd w:id="18"/>
+    <w:bookmarkStart w:id="19" w:name="annotation"/>
+    <w:p>
+      <w:pPr>
+        <w:pStyle w:val="Heading3"/>
+      </w:pPr>
+      <w:r>
+        <w:t xml:space="preserve">2.4 Annotation</w:t>
+      </w:r>
+    </w:p>
+    <w:p>
+      <w:pPr>
+        <w:pStyle w:val="FirstParagraph"/>
+      </w:pPr>
+      <w:r>
+        <w:t xml:space="preserve">Annotation is performed sentence by sentence with the Stanford Stanza processor (Qi et al. 2020, 101–8). Stanza (Stanford’s open-source Python toolkit for automatic linguistic annotation, which performs tokenisation, lemmatisation, part-of-speech tagging, morphological analysis, and dependency parsing in a single workflow) provides PROIEL-trained models for several of the older Indo-European languages: grc_proiel for Koine Greek, la_proiel for Latin, cu_proiel for Old Church Slavonic, and got_proiel for Gothic. Classical Armenian is annotated through a PROIEL-style workflow currently under development; ingestion of the v0.4 Armenian sample is complete, and the full v0.5 annotation will use a fine-tuned Stanza model (a fine-tuned model is one that has been further trained on a smaller, target-specific dataset on top of its general-purpose training, so that it adapts to the particular text type in question) trained on TITUS Armenian material. The Stanza output for each sentence is then normalised to the PROIEL XML 2.0 schema; AthDGC publishes PROIEL XML 2.0 only, with no CoNLL-U (the line-by-line tab-separated format used by the Universal Dependencies project, with one token per line and one column per annotation attribute) or other format offered, since the analytical workflow downstream of the corpus (argument-structure extraction, alignment graph, classifier features) depends on the PROIEL relation inventory. For the worked example, Stanza assigns μῆνιν the lemma μῆνις, part-of-speech Nb, morphology Nb-s—fa- (a noun, singular, feminine, accusative), head identifier 2, and relation obj (direct object). The verb ἄειδε receives lemma ἀείδω, part-of-speech V-, morphology V-spia— (verb, second person singular, present, imperative, active), head identifier 0 (sentence root), and relation pred (predicate).</w:t>
+      </w:r>
+    </w:p>
     <w:bookmarkEnd w:id="19"/>
-    <w:bookmarkStart w:id="26" w:name="dataset-description"/>
+    <w:bookmarkStart w:id="20" w:name="argument-structure-capture"/>
+    <w:p>
+      <w:pPr>
+        <w:pStyle w:val="Heading3"/>
+      </w:pPr>
+      <w:r>
+        <w:t xml:space="preserve">2.5 Argument-structure capture</w:t>
+      </w:r>
+    </w:p>
+    <w:p>
+      <w:pPr>
+        <w:pStyle w:val="FirstParagraph"/>
+      </w:pPr>
+      <w:r>
+        <w:t xml:space="preserve">Beyond standard dependency annotation, AthDGC extracts an explicit argument-structure frame for every verb token, using the PROIEL relation inventory strictly. The argument-structure frame records, for one verb, the syntactic and semantic role of each of its arguments: the subject (sub, including the raised patterns xobj for raising objects and nonsub for non-subject controllers), the direct object (obj), the indirect and oblique arguments (iobj for indirect object, obl for oblique), the vocative addressee (voc), the voice (active, middle, or passive), and the aspect (perfective or imperfective). For the worked example, the verb ἄειδε receives the frame [sub:imp.2sg, obj:μῆνιν(acc.sg.f), voc:θεὰ(voc.sg.f), voice:active, aspect:imperfective]. This frame is the unit on which downstream queries operate: a diachronic researcher can ask, for instance, across the Iliad reception, does the verb of singing retain its direct-object case-marking through the Byzantine epitome and the Modern Greek prose translation, or does it switch to a prepositional phrase? and receive an answer that does not require manual re-reading of the texts.</w:t>
+      </w:r>
+    </w:p>
+    <w:bookmarkEnd w:id="20"/>
+    <w:bookmarkStart w:id="21" w:name="cross-lingual-alignment"/>
+    <w:p>
+      <w:pPr>
+        <w:pStyle w:val="Heading3"/>
+      </w:pPr>
+      <w:r>
+        <w:t xml:space="preserve">2.6 Cross-lingual alignment</w:t>
+      </w:r>
+    </w:p>
+    <w:p>
+      <w:pPr>
+        <w:pStyle w:val="FirstParagraph"/>
+      </w:pPr>
+      <w:r>
+        <w:t xml:space="preserve">Sentence-level alignment uses LaBSE embeddings (Feng et al. 2022, 878–91). LaBSE (Language-Agnostic BERT Sentence Embedding, a multilingual sentence-embedding model that maps sentences from over 100 languages into a single 1,500-dimensional vector space, so that translation pairs land close to each other regardless of the source language) provides the similarity score used to match a Greek New Testament verse to its Latin Vulgate, Gothic Wulfila, Old Church Slavonic Marianus, or Classical Armenian counterpart. Word-level alignment uses multilingual-BERT attention through the AwesomeAlign procedure</w:t>
+      </w:r>
+      <w:r>
+        <w:t xml:space="preserve"> </w:t>
+      </w:r>
+      <w:r>
+        <w:t xml:space="preserve">(Dou and Neubig 2021, 2112–28)</w:t>
+      </w:r>
+      <w:r>
+        <w:t xml:space="preserve">. Multilingual BERT (Google’s neural language model pre-trained on text from 104 languages) emits cross-attention weights between the tokens of the source and target sentences; AwesomeAlign converts these weights into a discrete word-alignment matrix through a fine-tuning step on parallel corpora. Phonetic cognate scoring, finally, uses ASJP sound-class encoding (the Automated Similarity Judgment Program sound-class system, which reduces every phonetic segment to one of 41 equivalence classes that ignore fine phonetic detail) and LingPy edit distance</w:t>
+      </w:r>
+      <w:r>
+        <w:t xml:space="preserve"> </w:t>
+      </w:r>
+      <w:r>
+        <w:t xml:space="preserve">(List 2014, 1–228)</w:t>
+      </w:r>
+      <w:r>
+        <w:t xml:space="preserve"> </w:t>
+      </w:r>
+      <w:r>
+        <w:t xml:space="preserve">for detection of cognate pairs across the Indo-European witnesses.</w:t>
+      </w:r>
+    </w:p>
+    <w:bookmarkEnd w:id="21"/>
+    <w:bookmarkEnd w:id="22"/>
+    <w:bookmarkStart w:id="29" w:name="dataset-description"/>
     <w:p>
       <w:pPr>
         <w:pStyle w:val="Heading2"/>
@@ -863,7 +1007,7 @@
         </w:tc>
       </w:tr>
     </w:tbl>
-    <w:bookmarkStart w:id="22" w:name="open-access-source-provenance"/>
+    <w:bookmarkStart w:id="25" w:name="open-access-source-provenance"/>
     <w:p>
       <w:pPr>
         <w:pStyle w:val="Heading3"/>
@@ -880,7 +1024,7 @@
         <w:t xml:space="preserve">Every primary source text in AthDGC is open-access (public domain, CC-BY, CC-BY-SA, or equivalent). The annotation layer is AthDGC-original and released under CC-BY-4.0. Accordingly, the open-access chain is preserved from input through annotation to distribution.</w:t>
       </w:r>
     </w:p>
-    <w:bookmarkStart w:id="20" w:name="greek-per-period-source-map"/>
+    <w:bookmarkStart w:id="23" w:name="greek-per-period-source-map"/>
     <w:p>
       <w:pPr>
         <w:pStyle w:val="Heading4"/>
@@ -1255,8 +1399,8 @@
         </w:tc>
       </w:tr>
     </w:tbl>
-    <w:bookmarkEnd w:id="20"/>
-    <w:bookmarkStart w:id="21" w:name="X5df39f0a0025d74d30b7fff5210b3662db7b813"/>
+    <w:bookmarkEnd w:id="23"/>
+    <w:bookmarkStart w:id="24" w:name="X5df39f0a0025d74d30b7fff5210b3662db7b813"/>
     <w:p>
       <w:pPr>
         <w:pStyle w:val="Heading4"/>
@@ -1674,9 +1818,9 @@
         <w:t xml:space="preserve">In-copyright editions are never republished verbatim. Accordingly, AthDGC uses an open-access antecedent (for example, a pre-1928 Teubner edition, or the SBL Greek New Testament instead of the Nestle-Aland critical edition) or, where this is unavoidable, short quotation samples under fair use with full attribution. The annotation layer is always AthDGC-original and released under CC-BY-4.0, so that the open-access chain is preserved from the input texts through the syntactic and morphological annotation to the public deposition.</w:t>
       </w:r>
     </w:p>
-    <w:bookmarkEnd w:id="21"/>
-    <w:bookmarkEnd w:id="22"/>
-    <w:bookmarkStart w:id="23" w:name="indo-european-parallels-covered"/>
+    <w:bookmarkEnd w:id="24"/>
+    <w:bookmarkEnd w:id="25"/>
+    <w:bookmarkStart w:id="26" w:name="indo-european-parallels-covered"/>
     <w:p>
       <w:pPr>
         <w:pStyle w:val="Heading3"/>
@@ -2460,8 +2604,8 @@
         <w:t xml:space="preserve">Verified per-witness aligned-verse counts be reported in the v0.5 release notes once the ARIS audit pass closes. Accordingly, the v0.4 release provides the curated samples on the Samples page rather than full per-witness counts.</w:t>
       </w:r>
     </w:p>
-    <w:bookmarkEnd w:id="23"/>
-    <w:bookmarkStart w:id="24" w:name="X865201e721f3379b5250ae7a19b328bb9e630f2"/>
+    <w:bookmarkEnd w:id="26"/>
+    <w:bookmarkStart w:id="27" w:name="X865201e721f3379b5250ae7a19b328bb9e630f2"/>
     <w:p>
       <w:pPr>
         <w:pStyle w:val="Heading3"/>
@@ -2526,8 +2670,8 @@
         <w:t xml:space="preserve">The retelling and retranslation chain is, in this respect, the central contribution of AthDGC to diachronic-Greek and Indo-European comparative syntax: it is the data structure that makes the diachronic stability of a syntactic pattern computationally observable.</w:t>
       </w:r>
     </w:p>
-    <w:bookmarkEnd w:id="24"/>
-    <w:bookmarkStart w:id="25" w:name="tools-open-source"/>
+    <w:bookmarkEnd w:id="27"/>
+    <w:bookmarkStart w:id="28" w:name="tools-open-source"/>
     <w:p>
       <w:pPr>
         <w:pStyle w:val="Heading3"/>
@@ -2560,9 +2704,9 @@
         <w:t xml:space="preserve">Two automated gates run on every community pull request, namely a PROIEL XML 2.0 schema validator (which rejects UD-style labels such as nsubj, dobj, nmod, case) and a house-style check that enforces the project style guide.</w:t>
       </w:r>
     </w:p>
-    <w:bookmarkEnd w:id="25"/>
-    <w:bookmarkEnd w:id="26"/>
-    <w:bookmarkStart w:id="27" w:name="related-work-and-positioning"/>
+    <w:bookmarkEnd w:id="28"/>
+    <w:bookmarkEnd w:id="29"/>
+    <w:bookmarkStart w:id="30" w:name="related-work-and-positioning"/>
     <w:p>
       <w:pPr>
         <w:pStyle w:val="Heading2"/>
@@ -2611,8 +2755,8 @@
         <w:t xml:space="preserve">In broad terms, AthDGC’s contribution is therefore three-fold. First, the extension of PROIEL-schema syntactic annotation to the full diachronic span of Greek, from Archaic to Modern, under one schema. Secondly, the systematic inclusion of retelling and retranslation chains as a first-class data structure, so that the diachronic stability of a syntactic pattern becomes a computable quantity. Thirdly, the extension of the cross-lingual alignment beyond the four PROIEL witnesses, with Classical Armenian arriving at v0.5 and five further IE witnesses (Sanskrit, Old English, Avestan, Old Persian, and Ukrainian) at v0.7.</w:t>
       </w:r>
     </w:p>
-    <w:bookmarkEnd w:id="27"/>
-    <w:bookmarkStart w:id="28" w:name="reuse-potential"/>
+    <w:bookmarkEnd w:id="30"/>
+    <w:bookmarkStart w:id="31" w:name="reuse-potential"/>
     <w:p>
       <w:pPr>
         <w:pStyle w:val="Heading2"/>
@@ -2691,8 +2835,8 @@
         <w:t xml:space="preserve">Fourthly, digital editions and pedagogy. The showcase generator (51_build_showcase_site.py) produces browsable per-sample PROIEL trees from any JSONL (JSON Lines, the line-per-record plain-text format) corpus; the Quarto template pack (Quarto is an open-source publishing system that builds websites, slides, papers, and posters from a single source file) generates the whole multi-output site, namely HTML, Reveal.js slides, .docx, .pptx, Beamer, and an A0-format academic poster, from a single source. Both are open-source and reusable by other historical-treebank projects. The platform is taught as a KEDIVIM continuing-education course at NKUA, Ψηφιακά Εργαλεία για τη Διαχρονική Ανάλυση της Γλώσσας / Digital Tools for the Diachronic Analysis of Language, autumn 2026; see https://athdgc.github.io/training.html.</w:t>
       </w:r>
     </w:p>
-    <w:bookmarkEnd w:id="28"/>
-    <w:bookmarkStart w:id="29" w:name="access-and-format"/>
+    <w:bookmarkEnd w:id="31"/>
+    <w:bookmarkStart w:id="32" w:name="access-and-format"/>
     <w:p>
       <w:pPr>
         <w:pStyle w:val="Heading2"/>
@@ -2717,8 +2861,8 @@
         <w:t xml:space="preserve">The toolkit’s readiness per module is summarised in §3.4 and on the public Tools page at https://athdgc.github.io/tools.html. Five modules are LIVE today (the Quarto template pack, the showcase generator, the corpus-fix toolkit, the PROIEL XML 2.0 exporter inside the build workflow, and the Stanza annotation job script). Eight are IN SETUP and be included with the v0.5 release. The LightSIDE-AthDGC syntactic-feature fork, the NoSketch-style concordancer, the Neo4j alignment viewer, the valency-frame database client, the retranslation-pair browser, and the retelling-chain explorer are FORTHCOMING at v0.5.</w:t>
       </w:r>
     </w:p>
-    <w:bookmarkEnd w:id="29"/>
-    <w:bookmarkStart w:id="30" w:name="acknowledgements"/>
+    <w:bookmarkEnd w:id="32"/>
+    <w:bookmarkStart w:id="33" w:name="acknowledgements"/>
     <w:p>
       <w:pPr>
         <w:pStyle w:val="Heading2"/>
@@ -2751,8 +2895,8 @@
         <w:t xml:space="preserve">The team comprises Prof. Nikolaos Lavidas (Principal Investigator, NKUA), Prof. Emerita Kiki Nikiforidou (NKUA; Co-Editor of the Genres and Influential Texts volume), Prof. Dag Haug (University of Oslo; PROIEL Project Director), Prof. Leonid Kulikov (Ghent University; diachronic typology, valency questionnaires), Dr. Vassiliki Geka (NKUA; Post-Doctoral Researcher; Co-Editor of the Genres and Influential Texts volume), Dr. Vassileios Symeonidis (NKUA; Post-Doctoral Researcher), Dr. Theodoros Michalareas (NKUA; Post-Doctoral Researcher), Sofia Chionidi (NKUA; PhD Candidate), Anastasia Tsiropina (NKUA; PhD Candidate), Eleni Plakoutsi (NKUA; PhD Candidate), and Evangelos Argyropoulos (NKUA; Research Assistant).</w:t>
       </w:r>
     </w:p>
-    <w:bookmarkEnd w:id="30"/>
-    <w:bookmarkStart w:id="31" w:name="references"/>
+    <w:bookmarkEnd w:id="33"/>
+    <w:bookmarkStart w:id="34" w:name="references"/>
     <w:p>
       <w:pPr>
         <w:pStyle w:val="Heading2"/>
@@ -2809,77 +2953,7 @@
         <w:t xml:space="preserve">Qi, Peng, Yuhao Zhang, Yuhui Zhang, Jason Bolton, and Christopher D. Manning. 2020. “Stanza: A Python Natural Language Processing Toolkit for Many Human Languages.” Proceedings of the 58th Annual Meeting of the Association for Computational Linguistics: System Demonstrations (ACL 2020), 101–8.</w:t>
       </w:r>
     </w:p>
-    <w:bookmarkEnd w:id="31"/>
-    <w:bookmarkStart w:id="35" w:name="references-1"/>
-    <w:p>
-      <w:pPr>
-        <w:pStyle w:val="Heading2"/>
-      </w:pPr>
-      <w:r>
-        <w:t xml:space="preserve">References</w:t>
-      </w:r>
-    </w:p>
-    <w:bookmarkStart w:id="34" w:name="refs"/>
-    <w:bookmarkStart w:id="32" w:name="ref-dou2021"/>
-    <w:p>
-      <w:pPr>
-        <w:pStyle w:val="Bibliography"/>
-      </w:pPr>
-      <w:r>
-        <w:t xml:space="preserve">Dou, Zi-Yi, and Graham Neubig. 2021.</w:t>
-      </w:r>
-      <w:r>
-        <w:t xml:space="preserve"> </w:t>
-      </w:r>
-      <w:r>
-        <w:t xml:space="preserve">“Word Alignment by Fine-Tuning Embeddings on Parallel Corpora.”</w:t>
-      </w:r>
-      <w:r>
-        <w:t xml:space="preserve"> </w:t>
-      </w:r>
-      <w:r>
-        <w:rPr>
-          <w:i/>
-          <w:iCs/>
-        </w:rPr>
-        <w:t xml:space="preserve">Proceedings of the 16th Conference of the European Chapter of the Association for Computational Linguistics: Main Volume (EACL 2021)</w:t>
-      </w:r>
-      <w:r>
-        <w:t xml:space="preserve">, 2112–28.</w:t>
-      </w:r>
-    </w:p>
-    <w:bookmarkEnd w:id="32"/>
-    <w:bookmarkStart w:id="33" w:name="ref-list2014"/>
-    <w:p>
-      <w:pPr>
-        <w:pStyle w:val="Bibliography"/>
-      </w:pPr>
-      <w:r>
-        <w:t xml:space="preserve">List, Johann-Mattis. 2014.</w:t>
-      </w:r>
-      <w:r>
-        <w:t xml:space="preserve"> </w:t>
-      </w:r>
-      <w:r>
-        <w:rPr>
-          <w:i/>
-          <w:iCs/>
-        </w:rPr>
-        <w:t xml:space="preserve">Sequence Comparison in Historical Linguistics</w:t>
-      </w:r>
-      <w:r>
-        <w:t xml:space="preserve">. D</w:t>
-      </w:r>
-      <w:r>
-        <w:t xml:space="preserve">ü</w:t>
-      </w:r>
-      <w:r>
-        <w:t xml:space="preserve">sseldorf University Press.</w:t>
-      </w:r>
-    </w:p>
-    <w:bookmarkEnd w:id="33"/>
     <w:bookmarkEnd w:id="34"/>
-    <w:bookmarkEnd w:id="35"/>
     <w:sectPr>
       <w:pgSz w:h="15840" w:w="12240"/>
       <w:pgMar w:bottom="1417" w:footer="720" w:gutter="0" w:header="720" w:left="1417" w:right="1417" w:top="1417"/>

</xml_diff>

<commit_message>
AthDGC site update 2026-06-20 00:05 --- clean Quarto render, real Zenodo DOI 10.5281/zenodo.20439182, samples-only public release
</commit_message>
<xml_diff>
--- a/data_paper.docx
+++ b/data_paper.docx
@@ -380,7 +380,19 @@
         <w:pStyle w:val="BodyText"/>
       </w:pPr>
       <w:r>
-        <w:t xml:space="preserve">Accordingly, no openly licensed, end-to-end workflow currently covers the full diachronic record of Greek at the same level of annotation, with explicit argument-structure tagging (the recovery of who does what to whom for every verb in the corpus), and with reproducible cross-lingual alignment (the machine-readable matching of corresponding words and sentences between texts in different languages) to its sister Indo-European languages. AthDGC closes that gap.</w:t>
+        <w:t xml:space="preserve">Accordingly, no openly licensed, end-to-end workflow currently covers the full diachronic record of Greek at the same level of annotation, with explicit argument-structure tagging (the recovery of who does what to whom for every verb in the corpus), and with reproducible cross-lingual alignment (the machine-readable matching of corresponding words and sentences between texts in different languages) to its sister Indo-European languages. AthDGC closes that gap. AthDGC is the Athens node of the PROIEL family: we adopt the PROIEL XML 2.0 schema verbatim, we publish in that schema only, and we extend it diachronically across the eight periods of Greek. Dag Haug, founding director of the PROIEL project at Oslo, is a member of the AthDGC team and a co-author of this report; the formal designation</w:t>
+      </w:r>
+      <w:r>
+        <w:t xml:space="preserve"> </w:t>
+      </w:r>
+      <w:r>
+        <w:t xml:space="preserve">“Athens-PROIEL”</w:t>
+      </w:r>
+      <w:r>
+        <w:t xml:space="preserve"> </w:t>
+      </w:r>
+      <w:r>
+        <w:t xml:space="preserve">in the title block records this affiliation.</w:t>
       </w:r>
     </w:p>
     <w:p>
@@ -657,7 +669,7 @@
         <w:pStyle w:val="FirstParagraph"/>
       </w:pPr>
       <w:r>
-        <w:t xml:space="preserve">Annotation is performed sentence by sentence with the Stanford Stanza processor (Qi et al. 2020, 101–8). Stanza (Stanford’s open-source Python toolkit for automatic linguistic annotation, which performs tokenisation, lemmatisation, part-of-speech tagging, morphological analysis, and dependency parsing in a single workflow) provides PROIEL-trained models for several of the older Indo-European languages: grc_proiel for Koine Greek, la_proiel for Latin, cu_proiel for Old Church Slavonic, and got_proiel for Gothic. Classical Armenian is annotated through a PROIEL-style workflow currently under development; ingestion of the v0.4 Armenian sample is complete, and the full v0.5 annotation will use a fine-tuned Stanza model (a fine-tuned model is one that has been further trained on a smaller, target-specific dataset on top of its general-purpose training, so that it adapts to the particular text type in question) trained on TITUS Armenian material. The Stanza output for each sentence is then normalised to the PROIEL XML 2.0 schema; AthDGC publishes PROIEL XML 2.0 only, with no CoNLL-U (the line-by-line tab-separated format used by the Universal Dependencies project, with one token per line and one column per annotation attribute) or other format offered, since the analytical workflow downstream of the corpus (argument-structure extraction, alignment graph, classifier features) depends on the PROIEL relation inventory. For the worked example, Stanza assigns μῆνιν the lemma μῆνις, part-of-speech Nb, morphology Nb-s—fa- (a noun, singular, feminine, accusative), head identifier 2, and relation obj (direct object). The verb ἄειδε receives lemma ἀείδω, part-of-speech V-, morphology V-spia— (verb, second person singular, present, imperative, active), head identifier 0 (sentence root), and relation pred (predicate).</w:t>
+        <w:t xml:space="preserve">Annotation is performed sentence by sentence with the Stanford Stanza processor (Qi et al. 2020, 101–8). Stanza (Stanford’s open-source Python toolkit for automatic linguistic annotation, which performs tokenisation, lemmatisation, part-of-speech tagging, morphological analysis, and dependency parsing in a single workflow) provides PROIEL-trained models for several of the older Indo-European languages: grc_proiel for Koine Greek, la_proiel for Latin, cu_proiel for Old Church Slavonic, and got_proiel for Gothic. Classical Armenian is annotated through a PROIEL-style workflow currently under development; the v0.4 release reports the workflow configuration only, and the first audited Armenian alignment is planned for the v0.5 release (end of September 2026), using a fine-tuned Stanza model (a fine-tuned model is one that has been further trained on a smaller, target-specific dataset on top of its general-purpose training, so that it adapts to the particular text type in question) trained on TITUS Armenian material. The Stanza output for each sentence is then normalised to the PROIEL XML 2.0 schema; AthDGC publishes PROIEL XML 2.0 only, with no CoNLL-U (the line-by-line tab-separated format used by the Universal Dependencies project, with one token per line and one column per annotation attribute) or other format offered, since the analytical workflow downstream of the corpus (argument-structure extraction, alignment graph, classifier features) depends on the PROIEL relation inventory. For the worked example, Stanza assigns μῆνιν the lemma μῆνις, part-of-speech Nb, morphology Nb-s—fa- (a noun, singular, feminine, accusative), head identifier 2, and relation obj (direct object). The verb ἄειδε receives lemma ἀείδω, part-of-speech V-, morphology V-spia— (verb, second person singular, present, imperative, active), head identifier 0 (sentence root), and relation pred (predicate).</w:t>
       </w:r>
     </w:p>
     <w:bookmarkEnd w:id="19"/>
@@ -2601,7 +2613,7 @@
         <w:pStyle w:val="BodyText"/>
       </w:pPr>
       <w:r>
-        <w:t xml:space="preserve">Verified per-witness aligned-verse counts be reported in the v0.5 release notes once the ARIS audit pass closes. Accordingly, the v0.4 release provides the curated samples on the Samples page rather than full per-witness counts.</w:t>
+        <w:t xml:space="preserve">Verified per-witness aligned-verse counts will be reported in the v0.5 release notes (planned end of September 2026) once the ARIS audit pass closes. Accordingly, the v0.4 release provides the curated samples on the Samples page rather than full per-witness counts.</w:t>
       </w:r>
     </w:p>
     <w:bookmarkEnd w:id="26"/>
@@ -2752,7 +2764,7 @@
         <w:pStyle w:val="BodyText"/>
       </w:pPr>
       <w:r>
-        <w:t xml:space="preserve">In broad terms, AthDGC’s contribution is therefore three-fold. First, the extension of PROIEL-schema syntactic annotation to the full diachronic span of Greek, from Archaic to Modern, under one schema. Secondly, the systematic inclusion of retelling and retranslation chains as a first-class data structure, so that the diachronic stability of a syntactic pattern becomes a computable quantity. Thirdly, the extension of the cross-lingual alignment beyond the four PROIEL witnesses, with Classical Armenian arriving at v0.5 and five further IE witnesses (Sanskrit, Old English, Avestan, Old Persian, and Ukrainian) at v0.7.</w:t>
+        <w:t xml:space="preserve">In broad terms, AthDGC’s contribution is therefore three-fold. First, the extension of PROIEL-schema syntactic annotation to the full diachronic span of Greek, from Archaic to Modern, under one schema. AthDGC is, in this respect, the Athens node of the PROIEL family: we adopt the schema verbatim and we extend it diachronically. Secondly, the systematic inclusion of retelling and retranslation chains as a first-class data structure, so that the diachronic stability of a syntactic pattern becomes a computable quantity. Thirdly, the extension of the cross-lingual alignment beyond the four PROIEL witnesses, with the Classical Armenian alignment planned for the v0.5 release (end of September 2026) and an Old English partition already present in the corpus at v0.4. The longer-horizon IE expansion (Sanskrit, Avestan, Old Persian, Ukrainian) is reported on the public Status page rather than here, since it is forthcoming rather than released.</w:t>
       </w:r>
     </w:p>
     <w:bookmarkEnd w:id="30"/>
@@ -2786,7 +2798,7 @@
         <w:pStyle w:val="BodyText"/>
       </w:pPr>
       <w:r>
-        <w:t xml:space="preserve">Secondly, Indo-European comparative syntax. The verse-level cross-lingual alignment of the New Testament to Latin (Vulgate), Gothic (Wulfila), Old Church Slavonic (Marianus), and Classical Armenian provides aligned PROIEL parses across four sister Indo-European languages, with Sanskrit, Old English, Avestan, Old Persian, and Ukrainian queued at v0.7. In this respect, users can query the Neo4j alignment graph for typological correspondences. A worked query example is every Greek aorist active verb whose Latin Vulgate counterpart is passive, which is expressed in Cypher (Cypher is the query language of Neo4j, structurally analogous to SQL for relational databases, in which MATCH patterns are drawn directly with arrows between nodes) as MATCH (gk:Token {lang:</w:t>
+        <w:t xml:space="preserve">Secondly, Indo-European comparative syntax. The verse-level cross-lingual alignment of the New Testament to Latin (Vulgate), Gothic (Wulfila), and Old Church Slavonic (Marianus) provides aligned PROIEL parses across three sister Indo-European languages in v0.4, with Classical Armenian planned for v0.5 (end of September 2026). An Old English partition is present at v0.4; the further IE expansion is reported on the public Status page. In this respect, users can query the Neo4j alignment graph for typological correspondences. A worked query example is every Greek aorist active verb whose Latin Vulgate counterpart is passive, which is expressed in Cypher (Cypher is the query language of Neo4j, structurally analogous to SQL for relational databases, in which MATCH patterns are drawn directly with arrows between nodes) as MATCH (gk:Token {lang:</w:t>
       </w:r>
       <w:r>
         <w:t xml:space="preserve">“grc”</w:t>

</xml_diff>